<commit_message>
feat(main): remove large julia installer
</commit_message>
<xml_diff>
--- a/labs/lab01/report/report.docx
+++ b/labs/lab01/report/report.docx
@@ -25,7 +25,7 @@
         <w:t xml:space="preserve"> </w:t>
       </w:r>
       <w:r>
-        <w:t xml:space="preserve">9</w:t>
+        <w:t xml:space="preserve">1</w:t>
       </w:r>
     </w:p>
     <w:p>
@@ -33,25 +33,13 @@
         <w:pStyle w:val="Subtitle"/>
       </w:pPr>
       <w:r>
-        <w:t xml:space="preserve">Командная</w:t>
+        <w:t xml:space="preserve">Имитационное</w:t>
       </w:r>
       <w:r>
         <w:t xml:space="preserve"> </w:t>
       </w:r>
       <w:r>
-        <w:t xml:space="preserve">оболочка</w:t>
-      </w:r>
-      <w:r>
-        <w:t xml:space="preserve"> </w:t>
-      </w:r>
-      <w:r>
-        <w:t xml:space="preserve">Midnight</w:t>
-      </w:r>
-      <w:r>
-        <w:t xml:space="preserve"> </w:t>
-      </w:r>
-      <w:r>
-        <w:t xml:space="preserve">Commander</w:t>
+        <w:t xml:space="preserve">моделирование</w:t>
       </w:r>
     </w:p>
     <w:p>

</xml_diff>